<commit_message>
Agregar columnas de auditoria y eliminacion logica al analisis
</commit_message>
<xml_diff>
--- a/docs/01_Analisis_de_Requerimientos_9255.docx
+++ b/docs/01_Analisis_de_Requerimientos_9255.docx
@@ -6208,7 +6208,7 @@
                 <w:sz w:val="19"/>
                 <w:szCs w:val="19"/>
               </w:rPr>
-              <w:t xml:space="preserve">Los registros con movimientos asociados (productos, clientes, proveedores, empleados) no se eliminan; se desactivan.</w:t>
+              <w:t xml:space="preserve">Ningún registro se borra físicamente. La eliminación es lógica: se registra la fecha y el usuario que eliminó, y el registro deja de mostrarse en las operaciones, pero se conserva para el historial y los reportes.</w:t>
             </w:r>
           </w:p>
         </w:tc>
@@ -7120,7 +7120,7 @@
                 <w:sz w:val="19"/>
                 <w:szCs w:val="19"/>
               </w:rPr>
-              <w:t xml:space="preserve">Las tablas principales guardan el usuario y la fecha de creación de cada registro.</w:t>
+              <w:t xml:space="preserve">Todas las tablas guardan quién y cuándo creó, modificó y eliminó cada registro. Estos datos los llenan automáticamente los disparadores de la base de datos (ver sección 12.1).</w:t>
             </w:r>
           </w:p>
         </w:tc>
@@ -14489,6 +14489,780 @@
         </w:tc>
       </w:tr>
     </w:tbl>
+    <w:p>
+      <w:pPr>
+        <w:spacing w:after="120" w:line="276"/>
+        <w:jc w:val="both"/>
+      </w:pPr>
+      <w:r>
+        <w:t xml:space="preserve">Las fechas se guardan completas con el tipo DATE (por ejemplo FECHA_INICIO, FECHA_EMISION, FECHA_VENCIMIENTO). No se crean columnas separadas para día, mes o año: esos valores se obtienen en las consultas a partir de la fecha completa.</w:t>
+      </w:r>
+    </w:p>
+    <w:p>
+      <w:pPr>
+        <w:pStyle w:val="Heading2"/>
+        <w:keepNext/>
+        <w:spacing w:after="120" w:before="240"/>
+      </w:pPr>
+      <w:r>
+        <w:t xml:space="preserve">12.1 Columnas de auditoría</w:t>
+      </w:r>
+    </w:p>
+    <w:p>
+      <w:pPr>
+        <w:spacing w:after="120" w:line="276"/>
+        <w:jc w:val="both"/>
+      </w:pPr>
+      <w:r>
+        <w:t xml:space="preserve">Todas las tablas del modelo incluyen las siguientes seis columnas al final:</w:t>
+      </w:r>
+    </w:p>
+    <w:tbl>
+      <w:tblPr>
+        <w:tblW w:type="dxa" w:w="9360"/>
+        <w:tblBorders>
+          <w:top w:val="single" w:color="auto" w:sz="4"/>
+          <w:left w:val="single" w:color="auto" w:sz="4"/>
+          <w:bottom w:val="single" w:color="auto" w:sz="4"/>
+          <w:right w:val="single" w:color="auto" w:sz="4"/>
+          <w:insideH w:val="single" w:color="auto" w:sz="4"/>
+          <w:insideV w:val="single" w:color="auto" w:sz="4"/>
+        </w:tblBorders>
+      </w:tblPr>
+      <w:tblGrid>
+        <w:gridCol w:w="2848"/>
+        <w:gridCol w:w="1831"/>
+        <w:gridCol w:w="4681"/>
+      </w:tblGrid>
+      <w:tr>
+        <w:trPr>
+          <w:cantSplit/>
+          <w:tblHeader/>
+        </w:trPr>
+        <w:tc>
+          <w:tcPr>
+            <w:tcW w:type="dxa" w:w="2848"/>
+            <w:tcBorders>
+              <w:top w:val="single" w:color="8EAADB" w:sz="4"/>
+              <w:left w:val="single" w:color="8EAADB" w:sz="4"/>
+              <w:bottom w:val="single" w:color="8EAADB" w:sz="4"/>
+              <w:right w:val="single" w:color="8EAADB" w:sz="4"/>
+            </w:tcBorders>
+            <w:shd w:fill="1F3864" w:color="auto" w:val="clear"/>
+            <w:tcMar>
+              <w:top w:type="dxa" w:w="60"/>
+              <w:left w:type="dxa" w:w="100"/>
+              <w:bottom w:type="dxa" w:w="60"/>
+              <w:right w:type="dxa" w:w="100"/>
+            </w:tcMar>
+            <w:vAlign w:val="center"/>
+          </w:tcPr>
+          <w:p>
+            <w:pPr>
+              <w:jc w:val="left"/>
+            </w:pPr>
+            <w:r>
+              <w:rPr>
+                <w:b/>
+                <w:bCs/>
+                <w:color w:val="FFFFFF"/>
+                <w:sz w:val="19"/>
+                <w:szCs w:val="19"/>
+              </w:rPr>
+              <w:t xml:space="preserve">Columna</w:t>
+            </w:r>
+          </w:p>
+        </w:tc>
+        <w:tc>
+          <w:tcPr>
+            <w:tcW w:type="dxa" w:w="1831"/>
+            <w:tcBorders>
+              <w:top w:val="single" w:color="8EAADB" w:sz="4"/>
+              <w:left w:val="single" w:color="8EAADB" w:sz="4"/>
+              <w:bottom w:val="single" w:color="8EAADB" w:sz="4"/>
+              <w:right w:val="single" w:color="8EAADB" w:sz="4"/>
+            </w:tcBorders>
+            <w:shd w:fill="1F3864" w:color="auto" w:val="clear"/>
+            <w:tcMar>
+              <w:top w:type="dxa" w:w="60"/>
+              <w:left w:type="dxa" w:w="100"/>
+              <w:bottom w:type="dxa" w:w="60"/>
+              <w:right w:type="dxa" w:w="100"/>
+            </w:tcMar>
+            <w:vAlign w:val="center"/>
+          </w:tcPr>
+          <w:p>
+            <w:pPr>
+              <w:jc w:val="left"/>
+            </w:pPr>
+            <w:r>
+              <w:rPr>
+                <w:b/>
+                <w:bCs/>
+                <w:color w:val="FFFFFF"/>
+                <w:sz w:val="19"/>
+                <w:szCs w:val="19"/>
+              </w:rPr>
+              <w:t xml:space="preserve">Tipo</w:t>
+            </w:r>
+          </w:p>
+        </w:tc>
+        <w:tc>
+          <w:tcPr>
+            <w:tcW w:type="dxa" w:w="4681"/>
+            <w:tcBorders>
+              <w:top w:val="single" w:color="8EAADB" w:sz="4"/>
+              <w:left w:val="single" w:color="8EAADB" w:sz="4"/>
+              <w:bottom w:val="single" w:color="8EAADB" w:sz="4"/>
+              <w:right w:val="single" w:color="8EAADB" w:sz="4"/>
+            </w:tcBorders>
+            <w:shd w:fill="1F3864" w:color="auto" w:val="clear"/>
+            <w:tcMar>
+              <w:top w:type="dxa" w:w="60"/>
+              <w:left w:type="dxa" w:w="100"/>
+              <w:bottom w:type="dxa" w:w="60"/>
+              <w:right w:type="dxa" w:w="100"/>
+            </w:tcMar>
+            <w:vAlign w:val="center"/>
+          </w:tcPr>
+          <w:p>
+            <w:pPr>
+              <w:jc w:val="left"/>
+            </w:pPr>
+            <w:r>
+              <w:rPr>
+                <w:b/>
+                <w:bCs/>
+                <w:color w:val="FFFFFF"/>
+                <w:sz w:val="19"/>
+                <w:szCs w:val="19"/>
+              </w:rPr>
+              <w:t xml:space="preserve">Descripción</w:t>
+            </w:r>
+          </w:p>
+        </w:tc>
+      </w:tr>
+      <w:tr>
+        <w:trPr>
+          <w:cantSplit/>
+        </w:trPr>
+        <w:tc>
+          <w:tcPr>
+            <w:tcW w:type="dxa" w:w="2848"/>
+            <w:tcBorders>
+              <w:top w:val="single" w:color="8EAADB" w:sz="4"/>
+              <w:left w:val="single" w:color="8EAADB" w:sz="4"/>
+              <w:bottom w:val="single" w:color="8EAADB" w:sz="4"/>
+              <w:right w:val="single" w:color="8EAADB" w:sz="4"/>
+            </w:tcBorders>
+            <w:tcMar>
+              <w:top w:type="dxa" w:w="60"/>
+              <w:left w:type="dxa" w:w="100"/>
+              <w:bottom w:type="dxa" w:w="60"/>
+              <w:right w:type="dxa" w:w="100"/>
+            </w:tcMar>
+            <w:vAlign w:val="center"/>
+          </w:tcPr>
+          <w:p>
+            <w:pPr>
+              <w:jc w:val="left"/>
+            </w:pPr>
+            <w:r>
+              <w:rPr>
+                <w:b w:val="false"/>
+                <w:bCs w:val="false"/>
+                <w:sz w:val="19"/>
+                <w:szCs w:val="19"/>
+              </w:rPr>
+              <w:t xml:space="preserve">USUARIO_CREACION</w:t>
+            </w:r>
+          </w:p>
+        </w:tc>
+        <w:tc>
+          <w:tcPr>
+            <w:tcW w:type="dxa" w:w="1831"/>
+            <w:tcBorders>
+              <w:top w:val="single" w:color="8EAADB" w:sz="4"/>
+              <w:left w:val="single" w:color="8EAADB" w:sz="4"/>
+              <w:bottom w:val="single" w:color="8EAADB" w:sz="4"/>
+              <w:right w:val="single" w:color="8EAADB" w:sz="4"/>
+            </w:tcBorders>
+            <w:tcMar>
+              <w:top w:type="dxa" w:w="60"/>
+              <w:left w:type="dxa" w:w="100"/>
+              <w:bottom w:type="dxa" w:w="60"/>
+              <w:right w:type="dxa" w:w="100"/>
+            </w:tcMar>
+            <w:vAlign w:val="center"/>
+          </w:tcPr>
+          <w:p>
+            <w:pPr>
+              <w:jc w:val="left"/>
+            </w:pPr>
+            <w:r>
+              <w:rPr>
+                <w:b w:val="false"/>
+                <w:bCs w:val="false"/>
+                <w:sz w:val="19"/>
+                <w:szCs w:val="19"/>
+              </w:rPr>
+              <w:t xml:space="preserve">VARCHAR2(50)</w:t>
+            </w:r>
+          </w:p>
+        </w:tc>
+        <w:tc>
+          <w:tcPr>
+            <w:tcW w:type="dxa" w:w="4681"/>
+            <w:tcBorders>
+              <w:top w:val="single" w:color="8EAADB" w:sz="4"/>
+              <w:left w:val="single" w:color="8EAADB" w:sz="4"/>
+              <w:bottom w:val="single" w:color="8EAADB" w:sz="4"/>
+              <w:right w:val="single" w:color="8EAADB" w:sz="4"/>
+            </w:tcBorders>
+            <w:tcMar>
+              <w:top w:type="dxa" w:w="60"/>
+              <w:left w:type="dxa" w:w="100"/>
+              <w:bottom w:type="dxa" w:w="60"/>
+              <w:right w:type="dxa" w:w="100"/>
+            </w:tcMar>
+            <w:vAlign w:val="center"/>
+          </w:tcPr>
+          <w:p>
+            <w:pPr>
+              <w:jc w:val="left"/>
+            </w:pPr>
+            <w:r>
+              <w:rPr>
+                <w:b w:val="false"/>
+                <w:bCs w:val="false"/>
+                <w:sz w:val="19"/>
+                <w:szCs w:val="19"/>
+              </w:rPr>
+              <w:t xml:space="preserve">Usuario que creó el registro.</w:t>
+            </w:r>
+          </w:p>
+        </w:tc>
+      </w:tr>
+      <w:tr>
+        <w:trPr>
+          <w:cantSplit/>
+        </w:trPr>
+        <w:tc>
+          <w:tcPr>
+            <w:tcW w:type="dxa" w:w="2848"/>
+            <w:tcBorders>
+              <w:top w:val="single" w:color="8EAADB" w:sz="4"/>
+              <w:left w:val="single" w:color="8EAADB" w:sz="4"/>
+              <w:bottom w:val="single" w:color="8EAADB" w:sz="4"/>
+              <w:right w:val="single" w:color="8EAADB" w:sz="4"/>
+            </w:tcBorders>
+            <w:tcMar>
+              <w:top w:type="dxa" w:w="60"/>
+              <w:left w:type="dxa" w:w="100"/>
+              <w:bottom w:type="dxa" w:w="60"/>
+              <w:right w:type="dxa" w:w="100"/>
+            </w:tcMar>
+            <w:vAlign w:val="center"/>
+          </w:tcPr>
+          <w:p>
+            <w:pPr>
+              <w:jc w:val="left"/>
+            </w:pPr>
+            <w:r>
+              <w:rPr>
+                <w:b w:val="false"/>
+                <w:bCs w:val="false"/>
+                <w:sz w:val="19"/>
+                <w:szCs w:val="19"/>
+              </w:rPr>
+              <w:t xml:space="preserve">FECHA_CREACION</w:t>
+            </w:r>
+          </w:p>
+        </w:tc>
+        <w:tc>
+          <w:tcPr>
+            <w:tcW w:type="dxa" w:w="1831"/>
+            <w:tcBorders>
+              <w:top w:val="single" w:color="8EAADB" w:sz="4"/>
+              <w:left w:val="single" w:color="8EAADB" w:sz="4"/>
+              <w:bottom w:val="single" w:color="8EAADB" w:sz="4"/>
+              <w:right w:val="single" w:color="8EAADB" w:sz="4"/>
+            </w:tcBorders>
+            <w:tcMar>
+              <w:top w:type="dxa" w:w="60"/>
+              <w:left w:type="dxa" w:w="100"/>
+              <w:bottom w:type="dxa" w:w="60"/>
+              <w:right w:type="dxa" w:w="100"/>
+            </w:tcMar>
+            <w:vAlign w:val="center"/>
+          </w:tcPr>
+          <w:p>
+            <w:pPr>
+              <w:jc w:val="left"/>
+            </w:pPr>
+            <w:r>
+              <w:rPr>
+                <w:b w:val="false"/>
+                <w:bCs w:val="false"/>
+                <w:sz w:val="19"/>
+                <w:szCs w:val="19"/>
+              </w:rPr>
+              <w:t xml:space="preserve">DATE</w:t>
+            </w:r>
+          </w:p>
+        </w:tc>
+        <w:tc>
+          <w:tcPr>
+            <w:tcW w:type="dxa" w:w="4681"/>
+            <w:tcBorders>
+              <w:top w:val="single" w:color="8EAADB" w:sz="4"/>
+              <w:left w:val="single" w:color="8EAADB" w:sz="4"/>
+              <w:bottom w:val="single" w:color="8EAADB" w:sz="4"/>
+              <w:right w:val="single" w:color="8EAADB" w:sz="4"/>
+            </w:tcBorders>
+            <w:tcMar>
+              <w:top w:type="dxa" w:w="60"/>
+              <w:left w:type="dxa" w:w="100"/>
+              <w:bottom w:type="dxa" w:w="60"/>
+              <w:right w:type="dxa" w:w="100"/>
+            </w:tcMar>
+            <w:vAlign w:val="center"/>
+          </w:tcPr>
+          <w:p>
+            <w:pPr>
+              <w:jc w:val="left"/>
+            </w:pPr>
+            <w:r>
+              <w:rPr>
+                <w:b w:val="false"/>
+                <w:bCs w:val="false"/>
+                <w:sz w:val="19"/>
+                <w:szCs w:val="19"/>
+              </w:rPr>
+              <w:t xml:space="preserve">Fecha y hora de creación. Valor por defecto: SYSDATE.</w:t>
+            </w:r>
+          </w:p>
+        </w:tc>
+      </w:tr>
+      <w:tr>
+        <w:trPr>
+          <w:cantSplit/>
+        </w:trPr>
+        <w:tc>
+          <w:tcPr>
+            <w:tcW w:type="dxa" w:w="2848"/>
+            <w:tcBorders>
+              <w:top w:val="single" w:color="8EAADB" w:sz="4"/>
+              <w:left w:val="single" w:color="8EAADB" w:sz="4"/>
+              <w:bottom w:val="single" w:color="8EAADB" w:sz="4"/>
+              <w:right w:val="single" w:color="8EAADB" w:sz="4"/>
+            </w:tcBorders>
+            <w:tcMar>
+              <w:top w:type="dxa" w:w="60"/>
+              <w:left w:type="dxa" w:w="100"/>
+              <w:bottom w:type="dxa" w:w="60"/>
+              <w:right w:type="dxa" w:w="100"/>
+            </w:tcMar>
+            <w:vAlign w:val="center"/>
+          </w:tcPr>
+          <w:p>
+            <w:pPr>
+              <w:jc w:val="left"/>
+            </w:pPr>
+            <w:r>
+              <w:rPr>
+                <w:b w:val="false"/>
+                <w:bCs w:val="false"/>
+                <w:sz w:val="19"/>
+                <w:szCs w:val="19"/>
+              </w:rPr>
+              <w:t xml:space="preserve">USUARIO_MODIFICACION</w:t>
+            </w:r>
+          </w:p>
+        </w:tc>
+        <w:tc>
+          <w:tcPr>
+            <w:tcW w:type="dxa" w:w="1831"/>
+            <w:tcBorders>
+              <w:top w:val="single" w:color="8EAADB" w:sz="4"/>
+              <w:left w:val="single" w:color="8EAADB" w:sz="4"/>
+              <w:bottom w:val="single" w:color="8EAADB" w:sz="4"/>
+              <w:right w:val="single" w:color="8EAADB" w:sz="4"/>
+            </w:tcBorders>
+            <w:tcMar>
+              <w:top w:type="dxa" w:w="60"/>
+              <w:left w:type="dxa" w:w="100"/>
+              <w:bottom w:type="dxa" w:w="60"/>
+              <w:right w:type="dxa" w:w="100"/>
+            </w:tcMar>
+            <w:vAlign w:val="center"/>
+          </w:tcPr>
+          <w:p>
+            <w:pPr>
+              <w:jc w:val="left"/>
+            </w:pPr>
+            <w:r>
+              <w:rPr>
+                <w:b w:val="false"/>
+                <w:bCs w:val="false"/>
+                <w:sz w:val="19"/>
+                <w:szCs w:val="19"/>
+              </w:rPr>
+              <w:t xml:space="preserve">VARCHAR2(50)</w:t>
+            </w:r>
+          </w:p>
+        </w:tc>
+        <w:tc>
+          <w:tcPr>
+            <w:tcW w:type="dxa" w:w="4681"/>
+            <w:tcBorders>
+              <w:top w:val="single" w:color="8EAADB" w:sz="4"/>
+              <w:left w:val="single" w:color="8EAADB" w:sz="4"/>
+              <w:bottom w:val="single" w:color="8EAADB" w:sz="4"/>
+              <w:right w:val="single" w:color="8EAADB" w:sz="4"/>
+            </w:tcBorders>
+            <w:tcMar>
+              <w:top w:type="dxa" w:w="60"/>
+              <w:left w:type="dxa" w:w="100"/>
+              <w:bottom w:type="dxa" w:w="60"/>
+              <w:right w:type="dxa" w:w="100"/>
+            </w:tcMar>
+            <w:vAlign w:val="center"/>
+          </w:tcPr>
+          <w:p>
+            <w:pPr>
+              <w:jc w:val="left"/>
+            </w:pPr>
+            <w:r>
+              <w:rPr>
+                <w:b w:val="false"/>
+                <w:bCs w:val="false"/>
+                <w:sz w:val="19"/>
+                <w:szCs w:val="19"/>
+              </w:rPr>
+              <w:t xml:space="preserve">Último usuario que modificó el registro.</w:t>
+            </w:r>
+          </w:p>
+        </w:tc>
+      </w:tr>
+      <w:tr>
+        <w:trPr>
+          <w:cantSplit/>
+        </w:trPr>
+        <w:tc>
+          <w:tcPr>
+            <w:tcW w:type="dxa" w:w="2848"/>
+            <w:tcBorders>
+              <w:top w:val="single" w:color="8EAADB" w:sz="4"/>
+              <w:left w:val="single" w:color="8EAADB" w:sz="4"/>
+              <w:bottom w:val="single" w:color="8EAADB" w:sz="4"/>
+              <w:right w:val="single" w:color="8EAADB" w:sz="4"/>
+            </w:tcBorders>
+            <w:tcMar>
+              <w:top w:type="dxa" w:w="60"/>
+              <w:left w:type="dxa" w:w="100"/>
+              <w:bottom w:type="dxa" w:w="60"/>
+              <w:right w:type="dxa" w:w="100"/>
+            </w:tcMar>
+            <w:vAlign w:val="center"/>
+          </w:tcPr>
+          <w:p>
+            <w:pPr>
+              <w:jc w:val="left"/>
+            </w:pPr>
+            <w:r>
+              <w:rPr>
+                <w:b w:val="false"/>
+                <w:bCs w:val="false"/>
+                <w:sz w:val="19"/>
+                <w:szCs w:val="19"/>
+              </w:rPr>
+              <w:t xml:space="preserve">FECHA_MODIFICACION</w:t>
+            </w:r>
+          </w:p>
+        </w:tc>
+        <w:tc>
+          <w:tcPr>
+            <w:tcW w:type="dxa" w:w="1831"/>
+            <w:tcBorders>
+              <w:top w:val="single" w:color="8EAADB" w:sz="4"/>
+              <w:left w:val="single" w:color="8EAADB" w:sz="4"/>
+              <w:bottom w:val="single" w:color="8EAADB" w:sz="4"/>
+              <w:right w:val="single" w:color="8EAADB" w:sz="4"/>
+            </w:tcBorders>
+            <w:tcMar>
+              <w:top w:type="dxa" w:w="60"/>
+              <w:left w:type="dxa" w:w="100"/>
+              <w:bottom w:type="dxa" w:w="60"/>
+              <w:right w:type="dxa" w:w="100"/>
+            </w:tcMar>
+            <w:vAlign w:val="center"/>
+          </w:tcPr>
+          <w:p>
+            <w:pPr>
+              <w:jc w:val="left"/>
+            </w:pPr>
+            <w:r>
+              <w:rPr>
+                <w:b w:val="false"/>
+                <w:bCs w:val="false"/>
+                <w:sz w:val="19"/>
+                <w:szCs w:val="19"/>
+              </w:rPr>
+              <w:t xml:space="preserve">DATE</w:t>
+            </w:r>
+          </w:p>
+        </w:tc>
+        <w:tc>
+          <w:tcPr>
+            <w:tcW w:type="dxa" w:w="4681"/>
+            <w:tcBorders>
+              <w:top w:val="single" w:color="8EAADB" w:sz="4"/>
+              <w:left w:val="single" w:color="8EAADB" w:sz="4"/>
+              <w:bottom w:val="single" w:color="8EAADB" w:sz="4"/>
+              <w:right w:val="single" w:color="8EAADB" w:sz="4"/>
+            </w:tcBorders>
+            <w:tcMar>
+              <w:top w:type="dxa" w:w="60"/>
+              <w:left w:type="dxa" w:w="100"/>
+              <w:bottom w:type="dxa" w:w="60"/>
+              <w:right w:type="dxa" w:w="100"/>
+            </w:tcMar>
+            <w:vAlign w:val="center"/>
+          </w:tcPr>
+          <w:p>
+            <w:pPr>
+              <w:jc w:val="left"/>
+            </w:pPr>
+            <w:r>
+              <w:rPr>
+                <w:b w:val="false"/>
+                <w:bCs w:val="false"/>
+                <w:sz w:val="19"/>
+                <w:szCs w:val="19"/>
+              </w:rPr>
+              <w:t xml:space="preserve">Fecha y hora de la última modificación.</w:t>
+            </w:r>
+          </w:p>
+        </w:tc>
+      </w:tr>
+      <w:tr>
+        <w:trPr>
+          <w:cantSplit/>
+        </w:trPr>
+        <w:tc>
+          <w:tcPr>
+            <w:tcW w:type="dxa" w:w="2848"/>
+            <w:tcBorders>
+              <w:top w:val="single" w:color="8EAADB" w:sz="4"/>
+              <w:left w:val="single" w:color="8EAADB" w:sz="4"/>
+              <w:bottom w:val="single" w:color="8EAADB" w:sz="4"/>
+              <w:right w:val="single" w:color="8EAADB" w:sz="4"/>
+            </w:tcBorders>
+            <w:tcMar>
+              <w:top w:type="dxa" w:w="60"/>
+              <w:left w:type="dxa" w:w="100"/>
+              <w:bottom w:type="dxa" w:w="60"/>
+              <w:right w:type="dxa" w:w="100"/>
+            </w:tcMar>
+            <w:vAlign w:val="center"/>
+          </w:tcPr>
+          <w:p>
+            <w:pPr>
+              <w:jc w:val="left"/>
+            </w:pPr>
+            <w:r>
+              <w:rPr>
+                <w:b w:val="false"/>
+                <w:bCs w:val="false"/>
+                <w:sz w:val="19"/>
+                <w:szCs w:val="19"/>
+              </w:rPr>
+              <w:t xml:space="preserve">USUARIO_ELIMINACION</w:t>
+            </w:r>
+          </w:p>
+        </w:tc>
+        <w:tc>
+          <w:tcPr>
+            <w:tcW w:type="dxa" w:w="1831"/>
+            <w:tcBorders>
+              <w:top w:val="single" w:color="8EAADB" w:sz="4"/>
+              <w:left w:val="single" w:color="8EAADB" w:sz="4"/>
+              <w:bottom w:val="single" w:color="8EAADB" w:sz="4"/>
+              <w:right w:val="single" w:color="8EAADB" w:sz="4"/>
+            </w:tcBorders>
+            <w:tcMar>
+              <w:top w:type="dxa" w:w="60"/>
+              <w:left w:type="dxa" w:w="100"/>
+              <w:bottom w:type="dxa" w:w="60"/>
+              <w:right w:type="dxa" w:w="100"/>
+            </w:tcMar>
+            <w:vAlign w:val="center"/>
+          </w:tcPr>
+          <w:p>
+            <w:pPr>
+              <w:jc w:val="left"/>
+            </w:pPr>
+            <w:r>
+              <w:rPr>
+                <w:b w:val="false"/>
+                <w:bCs w:val="false"/>
+                <w:sz w:val="19"/>
+                <w:szCs w:val="19"/>
+              </w:rPr>
+              <w:t xml:space="preserve">VARCHAR2(50)</w:t>
+            </w:r>
+          </w:p>
+        </w:tc>
+        <w:tc>
+          <w:tcPr>
+            <w:tcW w:type="dxa" w:w="4681"/>
+            <w:tcBorders>
+              <w:top w:val="single" w:color="8EAADB" w:sz="4"/>
+              <w:left w:val="single" w:color="8EAADB" w:sz="4"/>
+              <w:bottom w:val="single" w:color="8EAADB" w:sz="4"/>
+              <w:right w:val="single" w:color="8EAADB" w:sz="4"/>
+            </w:tcBorders>
+            <w:tcMar>
+              <w:top w:type="dxa" w:w="60"/>
+              <w:left w:type="dxa" w:w="100"/>
+              <w:bottom w:type="dxa" w:w="60"/>
+              <w:right w:type="dxa" w:w="100"/>
+            </w:tcMar>
+            <w:vAlign w:val="center"/>
+          </w:tcPr>
+          <w:p>
+            <w:pPr>
+              <w:jc w:val="left"/>
+            </w:pPr>
+            <w:r>
+              <w:rPr>
+                <w:b w:val="false"/>
+                <w:bCs w:val="false"/>
+                <w:sz w:val="19"/>
+                <w:szCs w:val="19"/>
+              </w:rPr>
+              <w:t xml:space="preserve">Usuario que eliminó lógicamente el registro.</w:t>
+            </w:r>
+          </w:p>
+        </w:tc>
+      </w:tr>
+      <w:tr>
+        <w:trPr>
+          <w:cantSplit/>
+        </w:trPr>
+        <w:tc>
+          <w:tcPr>
+            <w:tcW w:type="dxa" w:w="2848"/>
+            <w:tcBorders>
+              <w:top w:val="single" w:color="8EAADB" w:sz="4"/>
+              <w:left w:val="single" w:color="8EAADB" w:sz="4"/>
+              <w:bottom w:val="single" w:color="8EAADB" w:sz="4"/>
+              <w:right w:val="single" w:color="8EAADB" w:sz="4"/>
+            </w:tcBorders>
+            <w:tcMar>
+              <w:top w:type="dxa" w:w="60"/>
+              <w:left w:type="dxa" w:w="100"/>
+              <w:bottom w:type="dxa" w:w="60"/>
+              <w:right w:type="dxa" w:w="100"/>
+            </w:tcMar>
+            <w:vAlign w:val="center"/>
+          </w:tcPr>
+          <w:p>
+            <w:pPr>
+              <w:jc w:val="left"/>
+            </w:pPr>
+            <w:r>
+              <w:rPr>
+                <w:b w:val="false"/>
+                <w:bCs w:val="false"/>
+                <w:sz w:val="19"/>
+                <w:szCs w:val="19"/>
+              </w:rPr>
+              <w:t xml:space="preserve">FECHA_ELIMINACION</w:t>
+            </w:r>
+          </w:p>
+        </w:tc>
+        <w:tc>
+          <w:tcPr>
+            <w:tcW w:type="dxa" w:w="1831"/>
+            <w:tcBorders>
+              <w:top w:val="single" w:color="8EAADB" w:sz="4"/>
+              <w:left w:val="single" w:color="8EAADB" w:sz="4"/>
+              <w:bottom w:val="single" w:color="8EAADB" w:sz="4"/>
+              <w:right w:val="single" w:color="8EAADB" w:sz="4"/>
+            </w:tcBorders>
+            <w:tcMar>
+              <w:top w:type="dxa" w:w="60"/>
+              <w:left w:type="dxa" w:w="100"/>
+              <w:bottom w:type="dxa" w:w="60"/>
+              <w:right w:type="dxa" w:w="100"/>
+            </w:tcMar>
+            <w:vAlign w:val="center"/>
+          </w:tcPr>
+          <w:p>
+            <w:pPr>
+              <w:jc w:val="left"/>
+            </w:pPr>
+            <w:r>
+              <w:rPr>
+                <w:b w:val="false"/>
+                <w:bCs w:val="false"/>
+                <w:sz w:val="19"/>
+                <w:szCs w:val="19"/>
+              </w:rPr>
+              <w:t xml:space="preserve">DATE</w:t>
+            </w:r>
+          </w:p>
+        </w:tc>
+        <w:tc>
+          <w:tcPr>
+            <w:tcW w:type="dxa" w:w="4681"/>
+            <w:tcBorders>
+              <w:top w:val="single" w:color="8EAADB" w:sz="4"/>
+              <w:left w:val="single" w:color="8EAADB" w:sz="4"/>
+              <w:bottom w:val="single" w:color="8EAADB" w:sz="4"/>
+              <w:right w:val="single" w:color="8EAADB" w:sz="4"/>
+            </w:tcBorders>
+            <w:tcMar>
+              <w:top w:type="dxa" w:w="60"/>
+              <w:left w:type="dxa" w:w="100"/>
+              <w:bottom w:type="dxa" w:w="60"/>
+              <w:right w:type="dxa" w:w="100"/>
+            </w:tcMar>
+            <w:vAlign w:val="center"/>
+          </w:tcPr>
+          <w:p>
+            <w:pPr>
+              <w:jc w:val="left"/>
+            </w:pPr>
+            <w:r>
+              <w:rPr>
+                <w:b w:val="false"/>
+                <w:bCs w:val="false"/>
+                <w:sz w:val="19"/>
+                <w:szCs w:val="19"/>
+              </w:rPr>
+              <w:t xml:space="preserve">Fecha y hora de eliminación. Si está vacía, el registro está activo.</w:t>
+            </w:r>
+          </w:p>
+        </w:tc>
+      </w:tr>
+    </w:tbl>
+    <w:p>
+      <w:pPr>
+        <w:spacing w:after="120"/>
+      </w:pPr>
+    </w:p>
+    <w:p>
+      <w:pPr>
+        <w:spacing w:after="120" w:line="276"/>
+        <w:jc w:val="both"/>
+      </w:pPr>
+      <w:r>
+        <w:t xml:space="preserve">Un disparador de auditoría por tabla llena estas columnas automáticamente al insertar o modificar. La aplicación informa a Oracle qué usuario inició sesión, de modo que la auditoría registra al usuario real del sistema y no al usuario de conexión a la base de datos. El usuario se guarda como texto y no como llave foránea, para no generar relaciones con USUARIO_9255 desde todas las tablas, lo que haría ilegible el diagrama entidad-relación.</w:t>
+      </w:r>
+    </w:p>
     <w:p>
       <w:pPr>
         <w:pStyle w:val="Heading1"/>

</xml_diff>